<commit_message>
Rewrite portfolio in a direct student voice
</commit_message>
<xml_diff>
--- a/Week-7_Final-ePortfolio-and-Self-Assessment/Madison_Parker_CS499_Professional_Self_Assessment.docx
+++ b/Week-7_Final-ePortfolio-and-Self-Assessment/Madison_Parker_CS499_Professional_Self_Assessment.docx
@@ -122,10 +122,11 @@
       </w:pPr>
       <w:r>
         <w:rPr>
-          <w:rFonts w:ascii="Times New Roman" w:hAnsi="Times New Roman" w:eastAsia="Times New Roman" w:cs="Times New Roman"/>
+          <w:rFonts w:ascii="Times New Roman" w:hAnsi="Times New Roman"/>
+          <w:b w:val="0"/>
           <w:sz w:val="24"/>
         </w:rPr>
-        <w:t xml:space="preserve">Three strengths define the work in this ePortfolio. First, I can revisit code honestly. I preserve the original state, identify specific defects, and separate a genuine enhancement from a cosmetic rewrite. Second, I make requirements testable. Field limits, ownership rules, ordering, error policies, and security assumptions become checks rather than intentions. Third, I communicate limits. I do not describe password hashing as encryption, a local SQLite project as a production identity platform, or a proposed Bluetooth feature as completed code. That precision matters to me because credibility is part of software quality.</w:t>
+        <w:t>One of the biggest changes in my work is that I can go back to old code without pretending it was better than it was. I keep the original version, name the problems I found, and make changes that affect behavior instead of only changing how the project looks. I also turn requirements into checks. Field limits, ownership rules, ordering, error behavior, and security assumptions should be testable. When something is outside the project, I say so. Password hashing is not encryption, a local SQLite app is not a production identity platform, and the Bluetooth idea is not finished code.</w:t>
       </w:r>
     </w:p>
     <w:p>
@@ -344,94 +345,11 @@
       </w:pPr>
       <w:r>
         <w:rPr>
-          <w:rFonts w:ascii="Times New Roman" w:hAnsi="Times New Roman" w:eastAsia="Times New Roman" w:cs="Times New Roman"/>
+          <w:rFonts w:ascii="Times New Roman" w:hAnsi="Times New Roman"/>
+          <w:b w:val="0"/>
           <w:sz w:val="24"/>
         </w:rPr>
-        <w:t xml:space="preserve">Those experiences influenced the ePortfolio’s layered communication. A hiring manager can begin with the problem, the completed change, and the outcome summary. A developer can continue to complexity analysis, schema documentation, diffs, test plans, and exact source. An instructor can trace each rubric element to evidence. The writing avoids unexplained claims such as</w:t>
-      </w:r>
-      <w:r>
-        <w:rPr>
-          <w:rFonts w:ascii="Times New Roman" w:hAnsi="Times New Roman" w:eastAsia="Times New Roman" w:cs="Times New Roman"/>
-          <w:sz w:val="24"/>
-        </w:rPr>
-        <w:t xml:space="preserve"> </w:t>
-      </w:r>
-      <w:r>
-        <w:rPr>
-          <w:rFonts w:ascii="Times New Roman" w:hAnsi="Times New Roman" w:eastAsia="Times New Roman" w:cs="Times New Roman"/>
-          <w:sz w:val="24"/>
-        </w:rPr>
-        <w:t xml:space="preserve">“</w:t>
-      </w:r>
-      <w:r>
-        <w:rPr>
-          <w:rFonts w:ascii="Times New Roman" w:hAnsi="Times New Roman" w:eastAsia="Times New Roman" w:cs="Times New Roman"/>
-          <w:sz w:val="24"/>
-        </w:rPr>
-        <w:t xml:space="preserve">optimized</w:t>
-      </w:r>
-      <w:r>
-        <w:rPr>
-          <w:rFonts w:ascii="Times New Roman" w:hAnsi="Times New Roman" w:eastAsia="Times New Roman" w:cs="Times New Roman"/>
-          <w:sz w:val="24"/>
-        </w:rPr>
-        <w:t xml:space="preserve">”</w:t>
-      </w:r>
-      <w:r>
-        <w:rPr>
-          <w:rFonts w:ascii="Times New Roman" w:hAnsi="Times New Roman" w:eastAsia="Times New Roman" w:cs="Times New Roman"/>
-          <w:sz w:val="24"/>
-        </w:rPr>
-        <w:t xml:space="preserve"> </w:t>
-      </w:r>
-      <w:r>
-        <w:rPr>
-          <w:rFonts w:ascii="Times New Roman" w:hAnsi="Times New Roman" w:eastAsia="Times New Roman" w:cs="Times New Roman"/>
-          <w:sz w:val="24"/>
-        </w:rPr>
-        <w:t xml:space="preserve">or</w:t>
-      </w:r>
-      <w:r>
-        <w:rPr>
-          <w:rFonts w:ascii="Times New Roman" w:hAnsi="Times New Roman" w:eastAsia="Times New Roman" w:cs="Times New Roman"/>
-          <w:sz w:val="24"/>
-        </w:rPr>
-        <w:t xml:space="preserve"> </w:t>
-      </w:r>
-      <w:r>
-        <w:rPr>
-          <w:rFonts w:ascii="Times New Roman" w:hAnsi="Times New Roman" w:eastAsia="Times New Roman" w:cs="Times New Roman"/>
-          <w:sz w:val="24"/>
-        </w:rPr>
-        <w:t xml:space="preserve">“</w:t>
-      </w:r>
-      <w:r>
-        <w:rPr>
-          <w:rFonts w:ascii="Times New Roman" w:hAnsi="Times New Roman" w:eastAsia="Times New Roman" w:cs="Times New Roman"/>
-          <w:sz w:val="24"/>
-        </w:rPr>
-        <w:t xml:space="preserve">secure.</w:t>
-      </w:r>
-      <w:r>
-        <w:rPr>
-          <w:rFonts w:ascii="Times New Roman" w:hAnsi="Times New Roman" w:eastAsia="Times New Roman" w:cs="Times New Roman"/>
-          <w:sz w:val="24"/>
-        </w:rPr>
-        <w:t xml:space="preserve">”</w:t>
-      </w:r>
-      <w:r>
-        <w:rPr>
-          <w:rFonts w:ascii="Times New Roman" w:hAnsi="Times New Roman" w:eastAsia="Times New Roman" w:cs="Times New Roman"/>
-          <w:sz w:val="24"/>
-        </w:rPr>
-        <w:t xml:space="preserve"> </w:t>
-      </w:r>
-      <w:r>
-        <w:rPr>
-          <w:rFonts w:ascii="Times New Roman" w:hAnsi="Times New Roman" w:eastAsia="Times New Roman" w:cs="Times New Roman"/>
-          <w:sz w:val="24"/>
-        </w:rPr>
-        <w:t xml:space="preserve">It states what became faster, safer, or more reliable, under which assumptions, and how that behavior was checked.</w:t>
+        <w:t>I used those lessons when I organized this ePortfolio. Someone can start with a short explanation of the problem and what I changed, then continue into the complexity notes, schema documentation, diffs, test plans, and source code. I avoided labels such as “optimized” or “secure” unless I could name the exact behavior, the assumptions behind it, and the check that supported it.</w:t>
       </w:r>
     </w:p>
     <w:p>
@@ -934,10 +852,11 @@
       </w:pPr>
       <w:r>
         <w:rPr>
-          <w:rFonts w:ascii="Times New Roman" w:hAnsi="Times New Roman" w:eastAsia="Times New Roman" w:cs="Times New Roman"/>
+          <w:rFonts w:ascii="Times New Roman" w:hAnsi="Times New Roman"/>
+          <w:b w:val="0"/>
           <w:sz w:val="24"/>
         </w:rPr>
-        <w:t xml:space="preserve">The ePortfolio is organized as a progression from assessment to evidence. The professional self-assessment comes first because it explains the standards I use to evaluate my own work. The code-review materials establish the original artifacts, identify design, algorithm, database, and security concerns, and state the planned enhancements. The three category pages then present the unchanged original artifact, the enhanced artifact, the narrative, focused before-and-after examples, outcome alignment, and verification.</w:t>
+        <w:t>I put the professional self-assessment first because it explains how I judge my own work. The written code review comes next and identifies the problems in the original projects. After that, the three category pages show the original code, my revised code, the narrative, before-and-after examples, and the checks I ran.</w:t>
       </w:r>
     </w:p>
     <w:p>
@@ -1103,26 +1022,19 @@
       </w:pPr>
       <w:r>
         <w:rPr>
-          <w:bCs/>
-          <w:rFonts w:ascii="Times New Roman" w:hAnsi="Times New Roman" w:eastAsia="Times New Roman" w:cs="Times New Roman"/>
+          <w:rFonts w:ascii="Times New Roman" w:hAnsi="Times New Roman"/>
           <w:b/>
           <w:sz w:val="24"/>
         </w:rPr>
-        <w:t xml:space="preserve">Outcome Four: Well-founded tools and techniques.</w:t>
+        <w:t>Outcome Four: Well-founded tools and techniques.</w:t>
       </w:r>
       <w:r>
         <w:rPr>
-          <w:rFonts w:ascii="Times New Roman" w:hAnsi="Times New Roman" w:eastAsia="Times New Roman" w:cs="Times New Roman"/>
+          <w:rFonts w:ascii="Times New Roman" w:hAnsi="Times New Roman"/>
+          <w:b w:val="0"/>
           <w:sz w:val="24"/>
         </w:rPr>
-        <w:t xml:space="preserve"> </w:t>
-      </w:r>
-      <w:r>
-        <w:rPr>
-          <w:rFonts w:ascii="Times New Roman" w:hAnsi="Times New Roman" w:eastAsia="Times New Roman" w:cs="Times New Roman"/>
-          <w:sz w:val="24"/>
-        </w:rPr>
-        <w:t xml:space="preserve">I use Java, Maven, JUnit, Android project structure, XML, SQLite, relational constraints, migrations, indexes, Gradle project files, cryptographic APIs, verification scripts, diffs, and GitHub Pages to produce reviewable solutions. The value is not the number of tools. It is using each one for a defined responsibility and verifying the behavior it supports.</w:t>
+        <w:t xml:space="preserve"> I used Java, Maven, JUnit, Android project structure, XML, SQLite, relational constraints, migrations, indexes, Gradle files, cryptographic APIs, verification scripts, diffs, and GitHub Pages. I chose them for specific jobs and checked the behavior they were supposed to support.</w:t>
       </w:r>
     </w:p>
     <w:p>
@@ -1178,10 +1090,11 @@
       </w:pPr>
       <w:r>
         <w:rPr>
-          <w:rFonts w:ascii="Times New Roman" w:hAnsi="Times New Roman" w:eastAsia="Times New Roman" w:cs="Times New Roman"/>
+          <w:rFonts w:ascii="Times New Roman" w:hAnsi="Times New Roman"/>
+          <w:b w:val="0"/>
           <w:sz w:val="24"/>
         </w:rPr>
-        <w:t xml:space="preserve">This work positions me for an entry-level application-development role in which I can contribute to Java, Android, API, database, testing, or full-stack tasks. I can read an existing codebase, preserve a reproducible baseline, identify a contained improvement, implement it, test it, and explain it. I am comfortable moving between user behavior and source-level details, which is useful in teams where developers work with product, design, quality assurance, and data stakeholders.</w:t>
+        <w:t>I am looking for an entry-level application-development role where I can contribute to Java, Android, API, database, testing, or full-stack work. I can read an existing codebase, keep a clean copy of the starting point, choose a manageable improvement, implement it, test it, and explain what I did. I am comfortable moving between what the user sees and what the code is doing underneath.</w:t>
       </w:r>
     </w:p>
     <w:p>
@@ -1204,10 +1117,11 @@
       </w:pPr>
       <w:r>
         <w:rPr>
-          <w:rFonts w:ascii="Times New Roman" w:hAnsi="Times New Roman" w:eastAsia="Times New Roman" w:cs="Times New Roman"/>
+          <w:rFonts w:ascii="Times New Roman" w:hAnsi="Times New Roman"/>
+          <w:b w:val="0"/>
           <w:sz w:val="24"/>
         </w:rPr>
-        <w:t xml:space="preserve">The ePortfolio should therefore be read as a record of both capability and judgment. It shows completed work, testable behavior, and measurable improvement. It also shows where I drew the line, why I drew it, and what I would address next. That combination represents the developer I am prepared to be: careful with existing systems, direct about evidence, and willing to improve a design after learning more about the people and data it serves.</w:t>
+        <w:t>This portfolio shows the work I finished, the behavior I tested, and the parts I would still change. I want to be the kind of developer who is careful with an existing system, honest about what the code proves, and willing to revise a design after learning more about the users and their data.</w:t>
       </w:r>
     </w:p>
     <w:bookmarkEnd w:id="28"/>

</xml_diff>

<commit_message>
Polish and verify final CS 499 ePortfolio
</commit_message>
<xml_diff>
--- a/Week-7_Final-ePortfolio-and-Self-Assessment/Madison_Parker_CS499_Professional_Self_Assessment.docx
+++ b/Week-7_Final-ePortfolio-and-Self-Assessment/Madison_Parker_CS499_Professional_Self_Assessment.docx
@@ -122,11 +122,10 @@
       </w:pPr>
       <w:r>
         <w:rPr>
-          <w:rFonts w:ascii="Times New Roman" w:hAnsi="Times New Roman"/>
-          <w:b w:val="0"/>
+          <w:rFonts w:ascii="Times New Roman" w:hAnsi="Times New Roman" w:eastAsia="Times New Roman" w:cs="Times New Roman"/>
           <w:sz w:val="24"/>
         </w:rPr>
-        <w:t>One of the biggest changes in my work is that I can go back to old code without pretending it was better than it was. I keep the original version, name the problems I found, and make changes that affect behavior instead of only changing how the project looks. I also turn requirements into checks. Field limits, ownership rules, ordering, error behavior, and security assumptions should be testable. When something is outside the project, I say so. Password hashing is not encryption, a local SQLite app is not a production identity platform, and the Bluetooth idea is not finished code.</w:t>
+        <w:t xml:space="preserve">Three strengths define the work in this ePortfolio. First, I can revisit code honestly. I preserve the original state, identify specific defects, and separate a genuine enhancement from a cosmetic rewrite. Second, I make requirements testable. Field limits, ownership rules, ordering, error policies, and security assumptions become checks rather than intentions. Third, I communicate limits. I do not describe password hashing as encryption, a local SQLite project as a production identity platform, or a proposed Bluetooth feature as completed code. That precision matters to me because credibility is part of software quality.</w:t>
       </w:r>
     </w:p>
     <w:p>
@@ -345,11 +344,94 @@
       </w:pPr>
       <w:r>
         <w:rPr>
-          <w:rFonts w:ascii="Times New Roman" w:hAnsi="Times New Roman"/>
-          <w:b w:val="0"/>
+          <w:rFonts w:ascii="Times New Roman" w:hAnsi="Times New Roman" w:eastAsia="Times New Roman" w:cs="Times New Roman"/>
           <w:sz w:val="24"/>
         </w:rPr>
-        <w:t>I used those lessons when I organized this ePortfolio. Someone can start with a short explanation of the problem and what I changed, then continue into the complexity notes, schema documentation, diffs, test plans, and source code. I avoided labels such as “optimized” or “secure” unless I could name the exact behavior, the assumptions behind it, and the check that supported it.</w:t>
+        <w:t xml:space="preserve">Those experiences influenced the ePortfolio’s layered communication. A hiring manager can begin with the problem, the completed change, and the outcome summary. A developer can continue to complexity analysis, schema documentation, diffs, test plans, and exact source. An instructor can trace each rubric element to evidence. The writing avoids unexplained claims such as</w:t>
+      </w:r>
+      <w:r>
+        <w:rPr>
+          <w:rFonts w:ascii="Times New Roman" w:hAnsi="Times New Roman" w:eastAsia="Times New Roman" w:cs="Times New Roman"/>
+          <w:sz w:val="24"/>
+        </w:rPr>
+        <w:t xml:space="preserve"> </w:t>
+      </w:r>
+      <w:r>
+        <w:rPr>
+          <w:rFonts w:ascii="Times New Roman" w:hAnsi="Times New Roman" w:eastAsia="Times New Roman" w:cs="Times New Roman"/>
+          <w:sz w:val="24"/>
+        </w:rPr>
+        <w:t xml:space="preserve">“</w:t>
+      </w:r>
+      <w:r>
+        <w:rPr>
+          <w:rFonts w:ascii="Times New Roman" w:hAnsi="Times New Roman" w:eastAsia="Times New Roman" w:cs="Times New Roman"/>
+          <w:sz w:val="24"/>
+        </w:rPr>
+        <w:t xml:space="preserve">optimized</w:t>
+      </w:r>
+      <w:r>
+        <w:rPr>
+          <w:rFonts w:ascii="Times New Roman" w:hAnsi="Times New Roman" w:eastAsia="Times New Roman" w:cs="Times New Roman"/>
+          <w:sz w:val="24"/>
+        </w:rPr>
+        <w:t xml:space="preserve">”</w:t>
+      </w:r>
+      <w:r>
+        <w:rPr>
+          <w:rFonts w:ascii="Times New Roman" w:hAnsi="Times New Roman" w:eastAsia="Times New Roman" w:cs="Times New Roman"/>
+          <w:sz w:val="24"/>
+        </w:rPr>
+        <w:t xml:space="preserve"> </w:t>
+      </w:r>
+      <w:r>
+        <w:rPr>
+          <w:rFonts w:ascii="Times New Roman" w:hAnsi="Times New Roman" w:eastAsia="Times New Roman" w:cs="Times New Roman"/>
+          <w:sz w:val="24"/>
+        </w:rPr>
+        <w:t xml:space="preserve">or</w:t>
+      </w:r>
+      <w:r>
+        <w:rPr>
+          <w:rFonts w:ascii="Times New Roman" w:hAnsi="Times New Roman" w:eastAsia="Times New Roman" w:cs="Times New Roman"/>
+          <w:sz w:val="24"/>
+        </w:rPr>
+        <w:t xml:space="preserve"> </w:t>
+      </w:r>
+      <w:r>
+        <w:rPr>
+          <w:rFonts w:ascii="Times New Roman" w:hAnsi="Times New Roman" w:eastAsia="Times New Roman" w:cs="Times New Roman"/>
+          <w:sz w:val="24"/>
+        </w:rPr>
+        <w:t xml:space="preserve">“</w:t>
+      </w:r>
+      <w:r>
+        <w:rPr>
+          <w:rFonts w:ascii="Times New Roman" w:hAnsi="Times New Roman" w:eastAsia="Times New Roman" w:cs="Times New Roman"/>
+          <w:sz w:val="24"/>
+        </w:rPr>
+        <w:t xml:space="preserve">secure.</w:t>
+      </w:r>
+      <w:r>
+        <w:rPr>
+          <w:rFonts w:ascii="Times New Roman" w:hAnsi="Times New Roman" w:eastAsia="Times New Roman" w:cs="Times New Roman"/>
+          <w:sz w:val="24"/>
+        </w:rPr>
+        <w:t xml:space="preserve">”</w:t>
+      </w:r>
+      <w:r>
+        <w:rPr>
+          <w:rFonts w:ascii="Times New Roman" w:hAnsi="Times New Roman" w:eastAsia="Times New Roman" w:cs="Times New Roman"/>
+          <w:sz w:val="24"/>
+        </w:rPr>
+        <w:t xml:space="preserve"> </w:t>
+      </w:r>
+      <w:r>
+        <w:rPr>
+          <w:rFonts w:ascii="Times New Roman" w:hAnsi="Times New Roman" w:eastAsia="Times New Roman" w:cs="Times New Roman"/>
+          <w:sz w:val="24"/>
+        </w:rPr>
+        <w:t xml:space="preserve">It states what became faster, safer, or more reliable, under which assumptions, and how that behavior was checked.</w:t>
       </w:r>
     </w:p>
     <w:p>
@@ -852,11 +934,10 @@
       </w:pPr>
       <w:r>
         <w:rPr>
-          <w:rFonts w:ascii="Times New Roman" w:hAnsi="Times New Roman"/>
-          <w:b w:val="0"/>
+          <w:rFonts w:ascii="Times New Roman" w:hAnsi="Times New Roman" w:eastAsia="Times New Roman" w:cs="Times New Roman"/>
           <w:sz w:val="24"/>
         </w:rPr>
-        <w:t>I put the professional self-assessment first because it explains how I judge my own work. The written code review comes next and identifies the problems in the original projects. After that, the three category pages show the original code, my revised code, the narrative, before-and-after examples, and the checks I ran.</w:t>
+        <w:t xml:space="preserve">The ePortfolio is organized as a progression from assessment to evidence. The professional self-assessment comes first because it explains the standards I use to evaluate my own work. The code-review materials establish the original artifacts, identify design, algorithm, database, and security concerns, and state the planned enhancements. The three category pages then present the unchanged original artifact, the enhanced artifact, the narrative, focused before-and-after examples, outcome alignment, and verification.</w:t>
       </w:r>
     </w:p>
     <w:p>
@@ -1022,19 +1103,26 @@
       </w:pPr>
       <w:r>
         <w:rPr>
-          <w:rFonts w:ascii="Times New Roman" w:hAnsi="Times New Roman"/>
+          <w:bCs/>
+          <w:rFonts w:ascii="Times New Roman" w:hAnsi="Times New Roman" w:eastAsia="Times New Roman" w:cs="Times New Roman"/>
           <w:b/>
           <w:sz w:val="24"/>
         </w:rPr>
-        <w:t>Outcome Four: Well-founded tools and techniques.</w:t>
+        <w:t xml:space="preserve">Outcome Four: Well-founded tools and techniques.</w:t>
       </w:r>
       <w:r>
         <w:rPr>
-          <w:rFonts w:ascii="Times New Roman" w:hAnsi="Times New Roman"/>
-          <w:b w:val="0"/>
+          <w:rFonts w:ascii="Times New Roman" w:hAnsi="Times New Roman" w:eastAsia="Times New Roman" w:cs="Times New Roman"/>
           <w:sz w:val="24"/>
         </w:rPr>
-        <w:t xml:space="preserve"> I used Java, Maven, JUnit, Android project structure, XML, SQLite, relational constraints, migrations, indexes, Gradle files, cryptographic APIs, verification scripts, diffs, and GitHub Pages. I chose them for specific jobs and checked the behavior they were supposed to support.</w:t>
+        <w:t xml:space="preserve"> </w:t>
+      </w:r>
+      <w:r>
+        <w:rPr>
+          <w:rFonts w:ascii="Times New Roman" w:hAnsi="Times New Roman" w:eastAsia="Times New Roman" w:cs="Times New Roman"/>
+          <w:sz w:val="24"/>
+        </w:rPr>
+        <w:t xml:space="preserve">I use Java, Maven, JUnit, Android project structure, XML, SQLite, relational constraints, migrations, indexes, Gradle project files, cryptographic APIs, verification scripts, diffs, and GitHub Pages to produce reviewable solutions. The value is not the number of tools. It is using each one for a defined responsibility and verifying the behavior it supports.</w:t>
       </w:r>
     </w:p>
     <w:p>
@@ -1090,11 +1178,10 @@
       </w:pPr>
       <w:r>
         <w:rPr>
-          <w:rFonts w:ascii="Times New Roman" w:hAnsi="Times New Roman"/>
-          <w:b w:val="0"/>
+          <w:rFonts w:ascii="Times New Roman" w:hAnsi="Times New Roman" w:eastAsia="Times New Roman" w:cs="Times New Roman"/>
           <w:sz w:val="24"/>
         </w:rPr>
-        <w:t>I am looking for an entry-level application-development role where I can contribute to Java, Android, API, database, testing, or full-stack work. I can read an existing codebase, keep a clean copy of the starting point, choose a manageable improvement, implement it, test it, and explain what I did. I am comfortable moving between what the user sees and what the code is doing underneath.</w:t>
+        <w:t xml:space="preserve">This work positions me for an entry-level application-development role in which I can contribute to Java, Android, API, database, testing, or full-stack tasks. I can read an existing codebase, preserve a reproducible baseline, identify a contained improvement, implement it, test it, and explain it. I am comfortable moving between user behavior and source-level details, which is useful in teams where developers work with product, design, quality assurance, and data stakeholders.</w:t>
       </w:r>
     </w:p>
     <w:p>
@@ -1117,11 +1204,10 @@
       </w:pPr>
       <w:r>
         <w:rPr>
-          <w:rFonts w:ascii="Times New Roman" w:hAnsi="Times New Roman"/>
-          <w:b w:val="0"/>
+          <w:rFonts w:ascii="Times New Roman" w:hAnsi="Times New Roman" w:eastAsia="Times New Roman" w:cs="Times New Roman"/>
           <w:sz w:val="24"/>
         </w:rPr>
-        <w:t>This portfolio shows the work I finished, the behavior I tested, and the parts I would still change. I want to be the kind of developer who is careful with an existing system, honest about what the code proves, and willing to revise a design after learning more about the users and their data.</w:t>
+        <w:t xml:space="preserve">The ePortfolio should therefore be read as a record of both capability and judgment. It shows completed work, testable behavior, and measurable improvement. It also shows where I drew the line, why I drew it, and what I would address next. That combination represents the developer I am prepared to be: careful with existing systems, direct about evidence, and willing to improve a design after learning more about the people and data it serves.</w:t>
       </w:r>
     </w:p>
     <w:bookmarkEnd w:id="28"/>

</xml_diff>